<commit_message>
update R and packages
</commit_message>
<xml_diff>
--- a/manuscript/ziehr_2023_mcti_supplement.docx
+++ b/manuscript/ziehr_2023_mcti_supplement.docx
@@ -1621,11 +1621,11 @@
     <w:next w:val="BodyText"/>
     <w:uiPriority w:val="9"/>
     <w:qFormat/>
-    <w:rsid w:val="002A7FF0"/>
+    <w:rsid w:val="000E081E"/>
     <w:pPr>
       <w:keepNext/>
       <w:keepLines/>
-      <w:spacing w:after="240"/>
+      <w:spacing w:after="240" w:before="360"/>
       <w:outlineLvl w:val="0"/>
     </w:pPr>
     <w:rPr>
@@ -1643,11 +1643,11 @@
     <w:uiPriority w:val="9"/>
     <w:unhideWhenUsed/>
     <w:qFormat/>
-    <w:rsid w:val="002A7FF0"/>
+    <w:rsid w:val="000E081E"/>
     <w:pPr>
       <w:keepNext/>
       <w:keepLines/>
-      <w:spacing w:after="240"/>
+      <w:spacing w:after="120"/>
       <w:outlineLvl w:val="1"/>
     </w:pPr>
     <w:rPr>
@@ -1664,11 +1664,11 @@
     <w:uiPriority w:val="9"/>
     <w:unhideWhenUsed/>
     <w:qFormat/>
-    <w:rsid w:val="002A7FF0"/>
+    <w:rsid w:val="000E081E"/>
     <w:pPr>
       <w:keepNext/>
       <w:keepLines/>
-      <w:spacing w:after="240"/>
+      <w:spacing w:after="0"/>
       <w:outlineLvl w:val="2"/>
     </w:pPr>
     <w:rPr>

</xml_diff>

<commit_message>
updates in response to co-author feedback
</commit_message>
<xml_diff>
--- a/manuscript/ziehr_2023_mcti_supplement.docx
+++ b/manuscript/ziehr_2023_mcti_supplement.docx
@@ -140,6 +140,66 @@
         <w:t xml:space="preserve"> </w:t>
       </w:r>
       <w:r>
+        <w:t xml:space="preserve">Fei</w:t>
+      </w:r>
+      <w:r>
+        <w:t xml:space="preserve"> </w:t>
+      </w:r>
+      <w:r>
+        <w:t xml:space="preserve">Li</w:t>
+      </w:r>
+      <w:r>
+        <w:rPr>
+          <w:vertAlign w:val="superscript"/>
+        </w:rPr>
+        <w:t xml:space="preserve">1</w:t>
+      </w:r>
+      <w:r>
+        <w:rPr>
+          <w:vertAlign w:val="superscript"/>
+        </w:rPr>
+        <w:t xml:space="preserve">,</w:t>
+      </w:r>
+      <w:r>
+        <w:rPr>
+          <w:vertAlign w:val="superscript"/>
+        </w:rPr>
+        <w:t xml:space="preserve">3</w:t>
+      </w:r>
+      <w:r>
+        <w:t xml:space="preserve">,</w:t>
+      </w:r>
+      <w:r>
+        <w:t xml:space="preserve"> </w:t>
+      </w:r>
+      <w:r>
+        <w:t xml:space="preserve">K.</w:t>
+      </w:r>
+      <w:r>
+        <w:t xml:space="preserve"> </w:t>
+      </w:r>
+      <w:r>
+        <w:t xml:space="preserve">Mark</w:t>
+      </w:r>
+      <w:r>
+        <w:t xml:space="preserve"> </w:t>
+      </w:r>
+      <w:r>
+        <w:t xml:space="preserve">Parnell</w:t>
+      </w:r>
+      <w:r>
+        <w:rPr>
+          <w:vertAlign w:val="superscript"/>
+        </w:rPr>
+        <w:t xml:space="preserve">4</w:t>
+      </w:r>
+      <w:r>
+        <w:t xml:space="preserve">,</w:t>
+      </w:r>
+      <w:r>
+        <w:t xml:space="preserve"> </w:t>
+      </w:r>
+      <w:r>
         <w:t xml:space="preserve">Nathan</w:t>
       </w:r>
       <w:r>
@@ -158,12 +218,24 @@
         <w:rPr>
           <w:vertAlign w:val="superscript"/>
         </w:rPr>
-        <w:t xml:space="preserve">4</w:t>
-      </w:r>
-      <w:r>
+        <w:t xml:space="preserve">5</w:t>
+      </w:r>
+      <w:r>
+        <w:rPr>
+          <w:vertAlign w:val="superscript"/>
+        </w:rPr>
         <w:t xml:space="preserve">,</w:t>
       </w:r>
       <w:r>
+        <w:rPr>
+          <w:vertAlign w:val="superscript"/>
+        </w:rPr>
+        <w:t xml:space="preserve">6</w:t>
+      </w:r>
+      <w:r>
+        <w:t xml:space="preserve">,</w:t>
+      </w:r>
+      <w:r>
         <w:t xml:space="preserve"> </w:t>
       </w:r>
       <w:r>
@@ -173,40 +245,346 @@
         <w:t xml:space="preserve"> </w:t>
       </w:r>
       <w:r>
+        <w:t xml:space="preserve">J.</w:t>
+      </w:r>
+      <w:r>
+        <w:t xml:space="preserve"> </w:t>
+      </w:r>
+      <w:r>
         <w:t xml:space="preserve">Leahy</w:t>
       </w:r>
       <w:r>
         <w:rPr>
           <w:vertAlign w:val="superscript"/>
         </w:rPr>
+        <w:t xml:space="preserve">1</w:t>
+      </w:r>
+      <w:r>
+        <w:t xml:space="preserve">,</w:t>
+      </w:r>
+      <w:r>
+        <w:t xml:space="preserve"> </w:t>
+      </w:r>
+      <w:r>
+        <w:t xml:space="preserve">Christelle</w:t>
+      </w:r>
+      <w:r>
+        <w:t xml:space="preserve"> </w:t>
+      </w:r>
+      <w:r>
+        <w:t xml:space="preserve">Guillermier</w:t>
+      </w:r>
+      <w:r>
+        <w:rPr>
+          <w:vertAlign w:val="superscript"/>
+        </w:rPr>
+        <w:t xml:space="preserve">1</w:t>
+      </w:r>
+      <w:r>
+        <w:rPr>
+          <w:vertAlign w:val="superscript"/>
+        </w:rPr>
+        <w:t xml:space="preserve">,</w:t>
+      </w:r>
+      <w:r>
+        <w:rPr>
+          <w:vertAlign w:val="superscript"/>
+        </w:rPr>
+        <w:t xml:space="preserve">3</w:t>
+      </w:r>
+      <w:r>
+        <w:t xml:space="preserve">,</w:t>
+      </w:r>
+      <w:r>
+        <w:t xml:space="preserve"> </w:t>
+      </w:r>
+      <w:r>
+        <w:t xml:space="preserve">Jack</w:t>
+      </w:r>
+      <w:r>
+        <w:t xml:space="preserve"> </w:t>
+      </w:r>
+      <w:r>
+        <w:t xml:space="preserve">Varon</w:t>
+      </w:r>
+      <w:r>
+        <w:rPr>
+          <w:vertAlign w:val="superscript"/>
+        </w:rPr>
+        <w:t xml:space="preserve">1</w:t>
+      </w:r>
+      <w:r>
+        <w:rPr>
+          <w:vertAlign w:val="superscript"/>
+        </w:rPr>
+        <w:t xml:space="preserve">,</w:t>
+      </w:r>
+      <w:r>
+        <w:rPr>
+          <w:vertAlign w:val="superscript"/>
+        </w:rPr>
+        <w:t xml:space="preserve">3</w:t>
+      </w:r>
+      <w:r>
+        <w:t xml:space="preserve">,</w:t>
+      </w:r>
+      <w:r>
+        <w:t xml:space="preserve"> </w:t>
+      </w:r>
+      <w:r>
+        <w:t xml:space="preserve">Rebecca</w:t>
+      </w:r>
+      <w:r>
+        <w:t xml:space="preserve"> </w:t>
+      </w:r>
+      <w:r>
+        <w:t xml:space="preserve">M.</w:t>
+      </w:r>
+      <w:r>
+        <w:t xml:space="preserve"> </w:t>
+      </w:r>
+      <w:r>
+        <w:t xml:space="preserve">Baron</w:t>
+      </w:r>
+      <w:r>
+        <w:rPr>
+          <w:vertAlign w:val="superscript"/>
+        </w:rPr>
+        <w:t xml:space="preserve">1</w:t>
+      </w:r>
+      <w:r>
+        <w:rPr>
+          <w:vertAlign w:val="superscript"/>
+        </w:rPr>
+        <w:t xml:space="preserve">,</w:t>
+      </w:r>
+      <w:r>
+        <w:rPr>
+          <w:vertAlign w:val="superscript"/>
+        </w:rPr>
+        <w:t xml:space="preserve">3</w:t>
+      </w:r>
+      <w:r>
+        <w:t xml:space="preserve">,</w:t>
+      </w:r>
+      <w:r>
+        <w:t xml:space="preserve"> </w:t>
+      </w:r>
+      <w:r>
+        <w:t xml:space="preserve">Bradley</w:t>
+      </w:r>
+      <w:r>
+        <w:t xml:space="preserve"> </w:t>
+      </w:r>
+      <w:r>
+        <w:t xml:space="preserve">A.</w:t>
+      </w:r>
+      <w:r>
+        <w:t xml:space="preserve"> </w:t>
+      </w:r>
+      <w:r>
+        <w:t xml:space="preserve">Maron</w:t>
+      </w:r>
+      <w:r>
+        <w:rPr>
+          <w:vertAlign w:val="superscript"/>
+        </w:rPr>
+        <w:t xml:space="preserve">7</w:t>
+      </w:r>
+      <w:r>
+        <w:rPr>
+          <w:vertAlign w:val="superscript"/>
+        </w:rPr>
+        <w:t xml:space="preserve">,</w:t>
+      </w:r>
+      <w:r>
+        <w:rPr>
+          <w:vertAlign w:val="superscript"/>
+        </w:rPr>
+        <w:t xml:space="preserve">8</w:t>
+      </w:r>
+      <w:r>
+        <w:t xml:space="preserve">,</w:t>
+      </w:r>
+      <w:r>
+        <w:t xml:space="preserve"> </w:t>
+      </w:r>
+      <w:r>
+        <w:t xml:space="preserve">Nancy</w:t>
+      </w:r>
+      <w:r>
+        <w:t xml:space="preserve"> </w:t>
+      </w:r>
+      <w:r>
+        <w:t xml:space="preserve">J.</w:t>
+      </w:r>
+      <w:r>
+        <w:t xml:space="preserve"> </w:t>
+      </w:r>
+      <w:r>
+        <w:t xml:space="preserve">Philp</w:t>
+      </w:r>
+      <w:r>
+        <w:rPr>
+          <w:vertAlign w:val="superscript"/>
+        </w:rPr>
+        <w:t xml:space="preserve">9</w:t>
+      </w:r>
+      <w:r>
+        <w:t xml:space="preserve">,</w:t>
+      </w:r>
+      <w:r>
+        <w:t xml:space="preserve"> </w:t>
+      </w:r>
+      <w:r>
+        <w:t xml:space="preserve">Lida</w:t>
+      </w:r>
+      <w:r>
+        <w:t xml:space="preserve"> </w:t>
+      </w:r>
+      <w:r>
+        <w:t xml:space="preserve">P.</w:t>
+      </w:r>
+      <w:r>
+        <w:t xml:space="preserve"> </w:t>
+      </w:r>
+      <w:r>
+        <w:t xml:space="preserve">Hariri</w:t>
+      </w:r>
+      <w:r>
+        <w:rPr>
+          <w:vertAlign w:val="superscript"/>
+        </w:rPr>
+        <w:t xml:space="preserve">3</w:t>
+      </w:r>
+      <w:r>
+        <w:rPr>
+          <w:vertAlign w:val="superscript"/>
+        </w:rPr>
+        <w:t xml:space="preserve">,</w:t>
+      </w:r>
+      <w:r>
+        <w:rPr>
+          <w:vertAlign w:val="superscript"/>
+        </w:rPr>
+        <w:t xml:space="preserve">10</w:t>
+      </w:r>
+      <w:r>
+        <w:t xml:space="preserve">,</w:t>
+      </w:r>
+      <w:r>
+        <w:t xml:space="preserve"> </w:t>
+      </w:r>
+      <w:r>
+        <w:t xml:space="preserve">Edy</w:t>
+      </w:r>
+      <w:r>
+        <w:t xml:space="preserve"> </w:t>
+      </w:r>
+      <w:r>
+        <w:t xml:space="preserve">Y.</w:t>
+      </w:r>
+      <w:r>
+        <w:t xml:space="preserve"> </w:t>
+      </w:r>
+      <w:r>
+        <w:t xml:space="preserve">Kim</w:t>
+      </w:r>
+      <w:r>
+        <w:rPr>
+          <w:vertAlign w:val="superscript"/>
+        </w:rPr>
+        <w:t xml:space="preserve">1</w:t>
+      </w:r>
+      <w:r>
+        <w:rPr>
+          <w:vertAlign w:val="superscript"/>
+        </w:rPr>
+        <w:t xml:space="preserve">,</w:t>
+      </w:r>
+      <w:r>
+        <w:rPr>
+          <w:vertAlign w:val="superscript"/>
+        </w:rPr>
+        <w:t xml:space="preserve">3</w:t>
+      </w:r>
+      <w:r>
+        <w:t xml:space="preserve">,</w:t>
+      </w:r>
+      <w:r>
+        <w:t xml:space="preserve"> </w:t>
+      </w:r>
+      <w:r>
+        <w:t xml:space="preserve">Matthew</w:t>
+      </w:r>
+      <w:r>
+        <w:t xml:space="preserve"> </w:t>
+      </w:r>
+      <w:r>
+        <w:t xml:space="preserve">L.</w:t>
+      </w:r>
+      <w:r>
+        <w:t xml:space="preserve"> </w:t>
+      </w:r>
+      <w:r>
+        <w:t xml:space="preserve">Steinhauser</w:t>
+      </w:r>
+      <w:r>
+        <w:rPr>
+          <w:vertAlign w:val="superscript"/>
+        </w:rPr>
+        <w:t xml:space="preserve">11</w:t>
+      </w:r>
+      <w:r>
+        <w:rPr>
+          <w:vertAlign w:val="superscript"/>
+        </w:rPr>
+        <w:t xml:space="preserve">,</w:t>
+      </w:r>
+      <w:r>
+        <w:rPr>
+          <w:vertAlign w:val="superscript"/>
+        </w:rPr>
+        <w:t xml:space="preserve">12</w:t>
+      </w:r>
+      <w:r>
+        <w:t xml:space="preserve">,</w:t>
+      </w:r>
+      <w:r>
+        <w:t xml:space="preserve"> </w:t>
+      </w:r>
+      <w:r>
+        <w:t xml:space="preserve">Rachel</w:t>
+      </w:r>
+      <w:r>
+        <w:t xml:space="preserve"> </w:t>
+      </w:r>
+      <w:r>
+        <w:t xml:space="preserve">S.</w:t>
+      </w:r>
+      <w:r>
+        <w:t xml:space="preserve"> </w:t>
+      </w:r>
+      <w:r>
+        <w:t xml:space="preserve">Knipe</w:t>
+      </w:r>
+      <w:r>
+        <w:rPr>
+          <w:vertAlign w:val="superscript"/>
+        </w:rPr>
         <w:t xml:space="preserve">2</w:t>
       </w:r>
       <w:r>
+        <w:rPr>
+          <w:vertAlign w:val="superscript"/>
+        </w:rPr>
         <w:t xml:space="preserve">,</w:t>
       </w:r>
       <w:r>
-        <w:t xml:space="preserve"> </w:t>
-      </w:r>
-      <w:r>
-        <w:t xml:space="preserve">K.</w:t>
-      </w:r>
-      <w:r>
-        <w:t xml:space="preserve"> </w:t>
-      </w:r>
-      <w:r>
-        <w:t xml:space="preserve">Mark</w:t>
-      </w:r>
-      <w:r>
-        <w:t xml:space="preserve"> </w:t>
-      </w:r>
-      <w:r>
-        <w:t xml:space="preserve">Parnell</w:t>
-      </w:r>
-      <w:r>
         <w:rPr>
           <w:vertAlign w:val="superscript"/>
         </w:rPr>
-        <w:t xml:space="preserve">5</w:t>
+        <w:t xml:space="preserve">3</w:t>
       </w:r>
       <w:r>
         <w:t xml:space="preserve">,</w:t>
@@ -215,19 +593,19 @@
         <w:t xml:space="preserve"> </w:t>
       </w:r>
       <w:r>
-        <w:t xml:space="preserve">Jack</w:t>
-      </w:r>
-      <w:r>
-        <w:t xml:space="preserve"> </w:t>
-      </w:r>
-      <w:r>
-        <w:t xml:space="preserve">Varon</w:t>
+        <w:t xml:space="preserve">Jared</w:t>
+      </w:r>
+      <w:r>
+        <w:t xml:space="preserve"> </w:t>
+      </w:r>
+      <w:r>
+        <w:t xml:space="preserve">Rutter</w:t>
       </w:r>
       <w:r>
         <w:rPr>
           <w:vertAlign w:val="superscript"/>
         </w:rPr>
-        <w:t xml:space="preserve">2</w:t>
+        <w:t xml:space="preserve">6</w:t>
       </w:r>
       <w:r>
         <w:rPr>
@@ -239,7 +617,7 @@
         <w:rPr>
           <w:vertAlign w:val="superscript"/>
         </w:rPr>
-        <w:t xml:space="preserve">3</w:t>
+        <w:t xml:space="preserve">13</w:t>
       </w:r>
       <w:r>
         <w:t xml:space="preserve">,</w:t>
@@ -248,7 +626,13 @@
         <w:t xml:space="preserve"> </w:t>
       </w:r>
       <w:r>
-        <w:t xml:space="preserve">Rebecca</w:t>
+        <w:t xml:space="preserve">and</w:t>
+      </w:r>
+      <w:r>
+        <w:t xml:space="preserve"> </w:t>
+      </w:r>
+      <w:r>
+        <w:t xml:space="preserve">William</w:t>
       </w:r>
       <w:r>
         <w:t xml:space="preserve"> </w:t>
@@ -260,235 +644,13 @@
         <w:t xml:space="preserve"> </w:t>
       </w:r>
       <w:r>
-        <w:t xml:space="preserve">Baron</w:t>
+        <w:t xml:space="preserve">Oldham</w:t>
       </w:r>
       <w:r>
         <w:rPr>
           <w:vertAlign w:val="superscript"/>
         </w:rPr>
-        <w:t xml:space="preserve">2</w:t>
-      </w:r>
-      <w:r>
-        <w:rPr>
-          <w:vertAlign w:val="superscript"/>
-        </w:rPr>
-        <w:t xml:space="preserve">,</w:t>
-      </w:r>
-      <w:r>
-        <w:rPr>
-          <w:vertAlign w:val="superscript"/>
-        </w:rPr>
-        <w:t xml:space="preserve">3</w:t>
-      </w:r>
-      <w:r>
-        <w:t xml:space="preserve">,</w:t>
-      </w:r>
-      <w:r>
-        <w:t xml:space="preserve"> </w:t>
-      </w:r>
-      <w:r>
-        <w:t xml:space="preserve">Nancy</w:t>
-      </w:r>
-      <w:r>
-        <w:t xml:space="preserve"> </w:t>
-      </w:r>
-      <w:r>
-        <w:t xml:space="preserve">J.</w:t>
-      </w:r>
-      <w:r>
-        <w:t xml:space="preserve"> </w:t>
-      </w:r>
-      <w:r>
-        <w:t xml:space="preserve">Philp</w:t>
-      </w:r>
-      <w:r>
-        <w:rPr>
-          <w:vertAlign w:val="superscript"/>
-        </w:rPr>
-        <w:t xml:space="preserve">6</w:t>
-      </w:r>
-      <w:r>
-        <w:t xml:space="preserve">,</w:t>
-      </w:r>
-      <w:r>
-        <w:t xml:space="preserve"> </w:t>
-      </w:r>
-      <w:r>
-        <w:t xml:space="preserve">Lida</w:t>
-      </w:r>
-      <w:r>
-        <w:t xml:space="preserve"> </w:t>
-      </w:r>
-      <w:r>
-        <w:t xml:space="preserve">P.</w:t>
-      </w:r>
-      <w:r>
-        <w:t xml:space="preserve"> </w:t>
-      </w:r>
-      <w:r>
-        <w:t xml:space="preserve">Hariri</w:t>
-      </w:r>
-      <w:r>
-        <w:rPr>
-          <w:vertAlign w:val="superscript"/>
-        </w:rPr>
-        <w:t xml:space="preserve">3</w:t>
-      </w:r>
-      <w:r>
-        <w:rPr>
-          <w:vertAlign w:val="superscript"/>
-        </w:rPr>
-        <w:t xml:space="preserve">,</w:t>
-      </w:r>
-      <w:r>
-        <w:rPr>
-          <w:vertAlign w:val="superscript"/>
-        </w:rPr>
-        <w:t xml:space="preserve">7</w:t>
-      </w:r>
-      <w:r>
-        <w:t xml:space="preserve">,</w:t>
-      </w:r>
-      <w:r>
-        <w:t xml:space="preserve"> </w:t>
-      </w:r>
-      <w:r>
-        <w:t xml:space="preserve">Edy</w:t>
-      </w:r>
-      <w:r>
-        <w:t xml:space="preserve"> </w:t>
-      </w:r>
-      <w:r>
-        <w:t xml:space="preserve">Y.</w:t>
-      </w:r>
-      <w:r>
-        <w:t xml:space="preserve"> </w:t>
-      </w:r>
-      <w:r>
-        <w:t xml:space="preserve">Kim</w:t>
-      </w:r>
-      <w:r>
-        <w:rPr>
-          <w:vertAlign w:val="superscript"/>
-        </w:rPr>
-        <w:t xml:space="preserve">2</w:t>
-      </w:r>
-      <w:r>
-        <w:rPr>
-          <w:vertAlign w:val="superscript"/>
-        </w:rPr>
-        <w:t xml:space="preserve">,</w:t>
-      </w:r>
-      <w:r>
-        <w:rPr>
-          <w:vertAlign w:val="superscript"/>
-        </w:rPr>
-        <w:t xml:space="preserve">3</w:t>
-      </w:r>
-      <w:r>
-        <w:t xml:space="preserve">,</w:t>
-      </w:r>
-      <w:r>
-        <w:t xml:space="preserve"> </w:t>
-      </w:r>
-      <w:r>
-        <w:t xml:space="preserve">Rachel</w:t>
-      </w:r>
-      <w:r>
-        <w:t xml:space="preserve"> </w:t>
-      </w:r>
-      <w:r>
-        <w:t xml:space="preserve">S.</w:t>
-      </w:r>
-      <w:r>
-        <w:t xml:space="preserve"> </w:t>
-      </w:r>
-      <w:r>
-        <w:t xml:space="preserve">Knipe</w:t>
-      </w:r>
-      <w:r>
-        <w:rPr>
-          <w:vertAlign w:val="superscript"/>
-        </w:rPr>
         <w:t xml:space="preserve">1</w:t>
-      </w:r>
-      <w:r>
-        <w:rPr>
-          <w:vertAlign w:val="superscript"/>
-        </w:rPr>
-        <w:t xml:space="preserve">,</w:t>
-      </w:r>
-      <w:r>
-        <w:rPr>
-          <w:vertAlign w:val="superscript"/>
-        </w:rPr>
-        <w:t xml:space="preserve">3</w:t>
-      </w:r>
-      <w:r>
-        <w:t xml:space="preserve">,</w:t>
-      </w:r>
-      <w:r>
-        <w:t xml:space="preserve"> </w:t>
-      </w:r>
-      <w:r>
-        <w:t xml:space="preserve">Jared</w:t>
-      </w:r>
-      <w:r>
-        <w:t xml:space="preserve"> </w:t>
-      </w:r>
-      <w:r>
-        <w:t xml:space="preserve">Rutter</w:t>
-      </w:r>
-      <w:r>
-        <w:rPr>
-          <w:vertAlign w:val="superscript"/>
-        </w:rPr>
-        <w:t xml:space="preserve">8</w:t>
-      </w:r>
-      <w:r>
-        <w:rPr>
-          <w:vertAlign w:val="superscript"/>
-        </w:rPr>
-        <w:t xml:space="preserve">,</w:t>
-      </w:r>
-      <w:r>
-        <w:rPr>
-          <w:vertAlign w:val="superscript"/>
-        </w:rPr>
-        <w:t xml:space="preserve">9</w:t>
-      </w:r>
-      <w:r>
-        <w:t xml:space="preserve">,</w:t>
-      </w:r>
-      <w:r>
-        <w:t xml:space="preserve"> </w:t>
-      </w:r>
-      <w:r>
-        <w:t xml:space="preserve">and</w:t>
-      </w:r>
-      <w:r>
-        <w:t xml:space="preserve"> </w:t>
-      </w:r>
-      <w:r>
-        <w:t xml:space="preserve">William</w:t>
-      </w:r>
-      <w:r>
-        <w:t xml:space="preserve"> </w:t>
-      </w:r>
-      <w:r>
-        <w:t xml:space="preserve">M.</w:t>
-      </w:r>
-      <w:r>
-        <w:t xml:space="preserve"> </w:t>
-      </w:r>
-      <w:r>
-        <w:t xml:space="preserve">Oldham</w:t>
-      </w:r>
-      <w:r>
-        <w:rPr>
-          <w:vertAlign w:val="superscript"/>
-        </w:rPr>
-        <w:t xml:space="preserve">2</w:t>
       </w:r>
       <w:r>
         <w:rPr>
@@ -529,6 +691,21 @@
         <w:t xml:space="preserve"> </w:t>
       </w:r>
       <w:r>
+        <w:t xml:space="preserve">Department of Medicine, Brigham and Women’s Hospital, Boston, MA</w:t>
+      </w:r>
+      <w:r>
+        <w:br/>
+      </w:r>
+      <w:r>
+        <w:rPr>
+          <w:vertAlign w:val="superscript"/>
+        </w:rPr>
+        <w:t xml:space="preserve">2</w:t>
+      </w:r>
+      <w:r>
+        <w:t xml:space="preserve"> </w:t>
+      </w:r>
+      <w:r>
         <w:t xml:space="preserve">Department of Medicine, Massachusetts General Hospital, Boston, MA</w:t>
       </w:r>
       <w:r>
@@ -538,13 +715,13 @@
         <w:rPr>
           <w:vertAlign w:val="superscript"/>
         </w:rPr>
-        <w:t xml:space="preserve">2</w:t>
-      </w:r>
-      <w:r>
-        <w:t xml:space="preserve"> </w:t>
-      </w:r>
-      <w:r>
-        <w:t xml:space="preserve">Department of Medicine, Brigham and Women’s Hospital and Harvard Medical School, Boston, MA</w:t>
+        <w:t xml:space="preserve">3</w:t>
+      </w:r>
+      <w:r>
+        <w:t xml:space="preserve"> </w:t>
+      </w:r>
+      <w:r>
+        <w:t xml:space="preserve">Department of Medicine, Harvard Medical School, Boston, MA</w:t>
       </w:r>
       <w:r>
         <w:br/>
@@ -553,13 +730,13 @@
         <w:rPr>
           <w:vertAlign w:val="superscript"/>
         </w:rPr>
-        <w:t xml:space="preserve">3</w:t>
-      </w:r>
-      <w:r>
-        <w:t xml:space="preserve"> </w:t>
-      </w:r>
-      <w:r>
-        <w:t xml:space="preserve">Department of Medicine, Harvard Medical School, Boston, MA</w:t>
+        <w:t xml:space="preserve">4</w:t>
+      </w:r>
+      <w:r>
+        <w:t xml:space="preserve"> </w:t>
+      </w:r>
+      <w:r>
+        <w:t xml:space="preserve">Vettore Biosciences, San Francisco, CA</w:t>
       </w:r>
       <w:r>
         <w:br/>
@@ -568,7 +745,7 @@
         <w:rPr>
           <w:vertAlign w:val="superscript"/>
         </w:rPr>
-        <w:t xml:space="preserve">4</w:t>
+        <w:t xml:space="preserve">5</w:t>
       </w:r>
       <w:r>
         <w:t xml:space="preserve"> </w:t>
@@ -583,13 +760,13 @@
         <w:rPr>
           <w:vertAlign w:val="superscript"/>
         </w:rPr>
-        <w:t xml:space="preserve">5</w:t>
-      </w:r>
-      <w:r>
-        <w:t xml:space="preserve"> </w:t>
-      </w:r>
-      <w:r>
-        <w:t xml:space="preserve">Vettore Biosciences, San Francisco, CA</w:t>
+        <w:t xml:space="preserve">6</w:t>
+      </w:r>
+      <w:r>
+        <w:t xml:space="preserve"> </w:t>
+      </w:r>
+      <w:r>
+        <w:t xml:space="preserve">Department of Biochemistry, University of Utah, Salt Lake City, UT</w:t>
       </w:r>
       <w:r>
         <w:br/>
@@ -598,7 +775,37 @@
         <w:rPr>
           <w:vertAlign w:val="superscript"/>
         </w:rPr>
-        <w:t xml:space="preserve">6</w:t>
+        <w:t xml:space="preserve">7</w:t>
+      </w:r>
+      <w:r>
+        <w:t xml:space="preserve"> </w:t>
+      </w:r>
+      <w:r>
+        <w:t xml:space="preserve">Department of Medicine, University of Maryland School of Medicine, Baltimore, MD</w:t>
+      </w:r>
+      <w:r>
+        <w:br/>
+      </w:r>
+      <w:r>
+        <w:rPr>
+          <w:vertAlign w:val="superscript"/>
+        </w:rPr>
+        <w:t xml:space="preserve">8</w:t>
+      </w:r>
+      <w:r>
+        <w:t xml:space="preserve"> </w:t>
+      </w:r>
+      <w:r>
+        <w:t xml:space="preserve">University of Maryland Institute for Health Computing, Bethesda, MD</w:t>
+      </w:r>
+      <w:r>
+        <w:br/>
+      </w:r>
+      <w:r>
+        <w:rPr>
+          <w:vertAlign w:val="superscript"/>
+        </w:rPr>
+        <w:t xml:space="preserve">9</w:t>
       </w:r>
       <w:r>
         <w:t xml:space="preserve"> </w:t>
@@ -613,7 +820,7 @@
         <w:rPr>
           <w:vertAlign w:val="superscript"/>
         </w:rPr>
-        <w:t xml:space="preserve">7</w:t>
+        <w:t xml:space="preserve">10</w:t>
       </w:r>
       <w:r>
         <w:t xml:space="preserve"> </w:t>
@@ -628,13 +835,13 @@
         <w:rPr>
           <w:vertAlign w:val="superscript"/>
         </w:rPr>
-        <w:t xml:space="preserve">8</w:t>
-      </w:r>
-      <w:r>
-        <w:t xml:space="preserve"> </w:t>
-      </w:r>
-      <w:r>
-        <w:t xml:space="preserve">Department of Biochemistry, University of Utah, Salt Lake City, UT</w:t>
+        <w:t xml:space="preserve">11</w:t>
+      </w:r>
+      <w:r>
+        <w:t xml:space="preserve"> </w:t>
+      </w:r>
+      <w:r>
+        <w:t xml:space="preserve">Aging Institute, University of Pittsburgh, Pittsburgh, PA</w:t>
       </w:r>
       <w:r>
         <w:br/>
@@ -643,7 +850,22 @@
         <w:rPr>
           <w:vertAlign w:val="superscript"/>
         </w:rPr>
-        <w:t xml:space="preserve">9</w:t>
+        <w:t xml:space="preserve">12</w:t>
+      </w:r>
+      <w:r>
+        <w:t xml:space="preserve"> </w:t>
+      </w:r>
+      <w:r>
+        <w:t xml:space="preserve">UPMC Heart and Vascular Institute, UPMC Presbyterian, Pittsburgh, PA</w:t>
+      </w:r>
+      <w:r>
+        <w:br/>
+      </w:r>
+      <w:r>
+        <w:rPr>
+          <w:vertAlign w:val="superscript"/>
+        </w:rPr>
+        <w:t xml:space="preserve">13</w:t>
       </w:r>
       <w:r>
         <w:t xml:space="preserve"> </w:t>
@@ -4800,7 +5022,7 @@
         <w:pStyle w:val="FirstParagraph"/>
       </w:pPr>
       <w:r>
-        <w:t xml:space="preserve">Recombinant human TGF-β1 was purchased commercially , dissolved in 10 mM citric acid, pH 3.0, filtered, and diluted to 10 μg/mL in PBS with 0.1% BSA prior to aliquoting and storing at -80 °C. AZD3965 (100 nM; Medkoo) and AR-C155858 (200 nM; Tocris) were purchased from commercial vendors. VB124 (10 μM) was a gift from Vettore, LLC. The drugs were prepared in DMSO and used at the indicated doses unless otherwise indicated. These doses were chosen based on prior reports and their target affinities.</w:t>
+        <w:t xml:space="preserve">Recombinant human TGFβ was purchased commercially , dissolved in 10 mM citric acid, pH 3.0, filtered, and diluted to 10 μg/mL in PBS with 0.1% BSA prior to aliquoting and storing at -80 °C. AZD3965 (100 nM; Medkoo) and AR-C155858 (200 nM; Tocris) were purchased from commercial vendors. VB124 (10 μM) was a gift from Vettore, LLC. The drugs were prepared in DMSO and used at the indicated doses unless otherwise indicated. These doses were chosen based on prior reports and their target affinities.</w:t>
       </w:r>
     </w:p>
     <w:bookmarkEnd w:id="22"/>
@@ -4974,7 +5196,7 @@
         <w:t xml:space="preserve"> </w:t>
       </w:r>
       <w:r>
-        <w:t xml:space="preserve">using recombinant human TGF-β1 (2 ng/mL) (Peprotech) for 48 h following 24 h serum starvation unless otherwise indicated.</w:t>
+        <w:t xml:space="preserve">using recombinant human TGFβ (2 ng/mL) (Peprotech) for 48 h following 24 h serum starvation unless otherwise indicated.</w:t>
       </w:r>
     </w:p>
     <w:bookmarkEnd w:id="25"/>
@@ -5983,13 +6205,7 @@
         <w:t xml:space="preserve">1</w:t>
       </w:r>
       <w:r>
-        <w:t xml:space="preserve">H ratios, respectively, using an open source plugin to ImageJ, OpenMIMS 3.0 (github.com/BWHCNI/OpenMIMS).</w:t>
-      </w:r>
-      <w:r>
-        <w:t xml:space="preserve"> </w:t>
-      </w:r>
-      <w:r>
-        <w:t xml:space="preserve">Ratio images are presented visually as hue saturation intensity images, with the blue lower bound of the scale set to the natural background ratio and the red upper bound of the scale set such that within tissue labeling differences are visually apparent. Changes to the scaling modify the visual appearance but not affect the quantitative data. Quantification of isotopic enrichment was based on a pixel ratio analysis of several MIMS images acquired per animal. Specifically, image masks were generated by Otsu thresholding the</w:t>
+        <w:t xml:space="preserve">H ratios, respectively, using an open source plugin to ImageJ, OpenMIMS 3.0 (github.com/BWHCNI/OpenMIMS). Ratio images are presented visually as hue saturation intensity images, with the blue lower bound of the scale set to the natural background ratio and the red upper bound of the scale set such that within tissue labeling differences are visually apparent. Changes to the scaling modify the visual appearance but not affect the quantitative data. Quantification of isotopic enrichment was based on a pixel ratio analysis of several MIMS images acquired per animal. Specifically, image masks were generated by Otsu thresholding the</w:t>
       </w:r>
       <w:r>
         <w:t xml:space="preserve"> </w:t>
@@ -6064,7 +6280,7 @@
         <w:pStyle w:val="FirstParagraph"/>
       </w:pPr>
       <w:r>
-        <w:t xml:space="preserve">VB253 was developed by Vettore, LLC as a more potent small molecule inhibitor of MCT4. Experiments involving VB253 were conducted by several contract research organizations under the supervision of Vettore, LLC. These experiments were completed independently of the other studies presented in the manuscript and offer independent validation of the antifibrotic effects of MCT4 inhibition in cells and mice.</w:t>
+        <w:t xml:space="preserve">VB253 was developed by Vettore, LLC as a more potent small molecule inhibitor of MCT4. Experiments involving VB253 were conducted by several contract research organizations under the supervision of Vettore, LLC, as described in detail below. These experiments were completed independently of the other studies presented in the manuscript and offer independent validation of the antifibrotic effects of MCT4 inhibition in cells and mice.</w:t>
       </w:r>
     </w:p>
     <w:p>
@@ -6072,11 +6288,47 @@
         <w:pStyle w:val="BodyText"/>
       </w:pPr>
       <w:r>
+        <w:t xml:space="preserve">All cell culture experiments were conducted by Charles River Laboratories (Wilmington, MA, USA). Lung fibroblasts from three independent IPF donors were seeded at a density of 750 cells/well in 384-well plates. Fibroblasts were subsequently treated with medium with 0.1% DMSO (vehicle control), 1.25 ng/ml TGFβ alone, 1.25 ng/ml TGFβ in the presence of 1 μM SB525334 (positive control), or 1.25 ng/ml TGFβ with 8-point concentration response curves (CRC) in biologic duplicate with semi-log dilutions of nintedanib or VB253. The top concentration tested was 10 μM. Cells were fixed with 4% paraformaldehyde 72 h post treatment with TGFβ. The principal readout was immunofluorescence staining to for α-SMA and DAPI to quantify the proportion of α-SMA-positive cells.</w:t>
+      </w:r>
+    </w:p>
+    <w:p>
+      <w:pPr>
+        <w:pStyle w:val="BodyText"/>
+      </w:pPr>
+      <w:r>
+        <w:t xml:space="preserve">SMAD3 nuclear translocation was evaluated in lung fibroblasts from one IPF donor. Cells were plated on Purecol-coated 96-well plates. Unstimulated (medium only) and stimulated cells (0.5 ng/ml TGFβ) were treated with 0.1% DMSO (vehicle control), 1 μM SB525334 (positive control), nintedanib in 8-point CRC, ALK5 inhibitor (SB525334) in 8-point CRC, and VB253 in a 16-point CRC, with a maximum concentration of 30 μM. All cells were fixed 2 h after treatment. The readout was immunofluorescence staining for pSMAD3 and DAPI.</w:t>
+      </w:r>
+    </w:p>
+    <w:p>
+      <w:pPr>
+        <w:pStyle w:val="BodyText"/>
+      </w:pPr>
+      <w:r>
+        <w:t xml:space="preserve">The</w:t>
+      </w:r>
+      <w:r>
+        <w:t xml:space="preserve"> </w:t>
+      </w:r>
+      <w:r>
         <w:rPr>
           <w:iCs/>
           <w:i/>
         </w:rPr>
-        <w:t xml:space="preserve">Nathan, Mark, and Jared. Add the names of the CROs that did the experiments? I think the aSMA/Smad3/nuclei experiments will need a description. The others are pretty similar to what is described above.</w:t>
+        <w:t xml:space="preserve">in vivo</w:t>
+      </w:r>
+      <w:r>
+        <w:t xml:space="preserve"> </w:t>
+      </w:r>
+      <w:r>
+        <w:t xml:space="preserve">therapeutic evaluation of VB253 in bleomycin-induced pulmonary fibrosis in both young and aged mice was conducted by Aragen Biosciences (Morgan Hill, CA, USA). In two separate experiments, C57Bl/6 mice, aged either 6-7 weeks or 68-70 weeks, were obtained from Jackson Labs (Bar Harbor, ME, USA). Under anesthesia, mice were administered either PBS vehicle (N = 10 per experiment) or 1.5 U/kg bleomycin in PBS intratracheally. After 7 days, mice treated with bleomycin were randomized to receive either vehicle (0.5% methylcellulose in saline) (N = 10), VB253 dissolved in 0.5% methylcellulose (3 mg/kg BID), Pirfenidone (Glentham Life Sciences Lid. Cat #GP4948, 100 mg/kg BID), or Nintedinib (Axon MedChem Cat#2648, 50 mg/kg, daily) (N = 10 per group). Mice injected with saline, rather than bleomycin, were administered vehicle. Treatments were administered daily until the experiment was terminated 21 days after bleomycin instillation, approximately 2-4 h after the final treatment dose. Whole-body plethysmography was performed on day 20 using Buxco WBP instrument system measuring Enhanced Pause (Penh) and respiratory rate on unrestrained animals. Upon experiment termination, lungs were inflated with 10% neutral buffered formalin (NBF) and fixed in 10% NBF for histology.</w:t>
+      </w:r>
+    </w:p>
+    <w:p>
+      <w:pPr>
+        <w:pStyle w:val="BodyText"/>
+      </w:pPr>
+      <w:r>
+        <w:t xml:space="preserve">Histology, imaging, and pathologic analyses were performed by HistoTox Labs (Boulder, CO, USA). Multiple slides per block were sectioned at 5 μm and stained with hematoxylin and eosin (H&amp;E) or by routine immunohistochemistry (IHC) methods for α-SMA. H&amp;E-stained glass slides were evaluated using light microscopy by an ACVP board-certified veterinary pathologist. Lung sections were scored according to the modified Ashcroft scale. Briefly, scores for five representative 200× microscopic fields per sample were averaged to obtain a mean score for each animal. α-SMA-stained glass slides were scanned using an Aperio AT2 whole slide scanner. Whole slide images were annotated to delineate regions of interest (ROI). Exclusions were applied to remove tissue artifacts (folds, tears, non-specific staining), large airways, and blood vessels. Visiopharm (VIS) image analysis software, using imaging filters to separate positive staining from counterstaining and background were applied to quantify α-SMA signal within each sample. Differences in expression levels between samples and treatments were evaluated by calculating the percent positive detection of cells or area within the viable lung tissue.</w:t>
       </w:r>
     </w:p>
     <w:p>

</xml_diff>

<commit_message>
small edits to Supplement
</commit_message>
<xml_diff>
--- a/manuscript/ziehr_2023_mcti_supplement.docx
+++ b/manuscript/ziehr_2023_mcti_supplement.docx
@@ -5982,7 +5982,7 @@
         <w:t xml:space="preserve">15</w:t>
       </w:r>
       <w:r>
-        <w:t xml:space="preserve">N]-proline (20 mg/mL) every 12 h prior to euthanasia on day 21 after bleomycin. Perfused and inflated lungs were fixed with formaldehyde/glutaraldehyde 2.5% in sodium cacodylate buffer, pH 7.4, embedded in EPON, section to 0.5 μm, mounted on silicon wafers, and gold coated. Sections were analyzed with the NanoSIMS 50L (CAMECA) housed in the Brigham and Women’s Hospital Center for NanoImaging, using previously developed analytical protocols</w:t>
+        <w:t xml:space="preserve">N]-proline (20 mg/mL) every 12 h prior to euthanasia on either day 21 or day 14 after bleomycin. Perfused and inflated lungs were fixed with formaldehyde/glutaraldehyde 2.5% in sodium cacodylate buffer, pH 7.4, embedded in EPON, section to 0.5 μm, mounted on silicon wafers, and gold coated. Sections were analyzed with the NanoSIMS 50L (CAMECA) housed in the Brigham and Women’s Hospital Center for NanoImaging, using previously developed analytical protocols</w:t>
       </w:r>
       <w:r>
         <w:t xml:space="preserve"> </w:t>
@@ -6296,7 +6296,7 @@
         <w:pStyle w:val="BodyText"/>
       </w:pPr>
       <w:r>
-        <w:t xml:space="preserve">SMAD3 nuclear translocation was evaluated in lung fibroblasts from one IPF donor. Cells were plated on Purecol-coated 96-well plates. Unstimulated (medium only) and stimulated cells (0.5 ng/ml TGFβ) were treated with 0.1% DMSO (vehicle control), 1 μM SB525334 (positive control), nintedanib in 8-point CRC, ALK5 inhibitor (SB525334) in 8-point CRC, and VB253 in a 16-point CRC, with a maximum concentration of 30 μM. All cells were fixed 2 h after treatment. The readout was immunofluorescence staining for pSMAD3 and DAPI.</w:t>
+        <w:t xml:space="preserve">SMAD3 nuclear translocation was evaluated in lung fibroblasts from one IPF donor. Cells were plated on Purecol-coated 96-well plates. Unstimulated (medium only) and stimulated cells (0.5 ng/ml TGFβ) were treated with 0.1% DMSO (vehicle control), 1 μM SB525334 (positive control), nintedanib in 8-point CRC, ALK5 inhibitor (SB525334) in 8-point CRC, and VB253 in a 16-point CRC, with a maximum concentration of 30 μM. All cells were fixed 2 h after treatment. The readout was immunofluorescence staining for pSmad3 and DAPI.</w:t>
       </w:r>
     </w:p>
     <w:p>

</xml_diff>